<commit_message>
Agrega dashboard 5: despacho a instituciones y falsos positivos
El dashboard muestra la regla de enrutamiento del despachador junto a los
envíos reales a PNC, Bomberos, CONRED y la aseguradora, y la lista de envíos
filtrable por institución (los falsos positivos no se envían a nadie).
Además explica cómo un pánico pasa a alerta real y clasifica cada pánico:
pendiente, pasó a alerta real, falso positivo real o falso positivo
corregido (marcado como falso con el correlador atrasado y confirmado
después). Todo se calcula con consultas de solo lectura.

Se actualizan los entregables 3, 6 y 7 con la nueva vista, el README, el
guion de la demo, la explicación del proyecto y las notas de ADRs.
</commit_message>
<xml_diff>
--- a/docs/entrega/Entregable-3-Configuracion-de-servicios-y-contenedores.docx
+++ b/docs/entrega/Entregable-3-Configuracion-de-servicios-y-contenedores.docx
@@ -126,7 +126,7 @@
     <w:sdt>
       <w:sdtPr>
         <w:alias w:val="Índice"/>
-        <w:id w:val="634533465"/>
+        <w:id w:val="694354538"/>
       </w:sdtPr>
       <w:sdtEndPr/>
       <w:sdtContent>
@@ -154,7 +154,7 @@
           <w:r>
             <w:fldChar w:fldCharType="separate"/>
           </w:r>
-          <w:hyperlink w:anchor="_Toc242024345" w:history="1">
+          <w:hyperlink w:anchor="_Toc243326510" w:history="1">
             <w:r>
               <w:rPr>
                 <w:rStyle w:val="Hipervnculo"/>
@@ -178,7 +178,7 @@
               <w:rPr>
                 <w:noProof/>
               </w:rPr>
-              <w:instrText xml:space="preserve"> PAGEREF _Toc242024345 \h </w:instrText>
+              <w:instrText xml:space="preserve"> PAGEREF _Toc243326510 \h </w:instrText>
             </w:r>
             <w:r>
               <w:rPr>
@@ -220,7 +220,7 @@
               <w14:ligatures w14:val="standardContextual"/>
             </w:rPr>
           </w:pPr>
-          <w:hyperlink w:anchor="_Toc242024346" w:history="1">
+          <w:hyperlink w:anchor="_Toc243326511" w:history="1">
             <w:r>
               <w:rPr>
                 <w:rStyle w:val="Hipervnculo"/>
@@ -244,7 +244,7 @@
               <w:rPr>
                 <w:noProof/>
               </w:rPr>
-              <w:instrText xml:space="preserve"> PAGEREF _Toc242024346 \h </w:instrText>
+              <w:instrText xml:space="preserve"> PAGEREF _Toc243326511 \h </w:instrText>
             </w:r>
             <w:r>
               <w:rPr>
@@ -286,7 +286,7 @@
               <w14:ligatures w14:val="standardContextual"/>
             </w:rPr>
           </w:pPr>
-          <w:hyperlink w:anchor="_Toc242024347" w:history="1">
+          <w:hyperlink w:anchor="_Toc243326512" w:history="1">
             <w:r>
               <w:rPr>
                 <w:rStyle w:val="Hipervnculo"/>
@@ -310,7 +310,7 @@
               <w:rPr>
                 <w:noProof/>
               </w:rPr>
-              <w:instrText xml:space="preserve"> PAGEREF _Toc242024347 \h </w:instrText>
+              <w:instrText xml:space="preserve"> PAGEREF _Toc243326512 \h </w:instrText>
             </w:r>
             <w:r>
               <w:rPr>
@@ -352,7 +352,7 @@
               <w14:ligatures w14:val="standardContextual"/>
             </w:rPr>
           </w:pPr>
-          <w:hyperlink w:anchor="_Toc242024348" w:history="1">
+          <w:hyperlink w:anchor="_Toc243326513" w:history="1">
             <w:r>
               <w:rPr>
                 <w:rStyle w:val="Hipervnculo"/>
@@ -376,7 +376,7 @@
               <w:rPr>
                 <w:noProof/>
               </w:rPr>
-              <w:instrText xml:space="preserve"> PAGEREF _Toc242024348 \h </w:instrText>
+              <w:instrText xml:space="preserve"> PAGEREF _Toc243326513 \h </w:instrText>
             </w:r>
             <w:r>
               <w:rPr>
@@ -418,7 +418,7 @@
               <w14:ligatures w14:val="standardContextual"/>
             </w:rPr>
           </w:pPr>
-          <w:hyperlink w:anchor="_Toc242024349" w:history="1">
+          <w:hyperlink w:anchor="_Toc243326514" w:history="1">
             <w:r>
               <w:rPr>
                 <w:rStyle w:val="Hipervnculo"/>
@@ -442,7 +442,7 @@
               <w:rPr>
                 <w:noProof/>
               </w:rPr>
-              <w:instrText xml:space="preserve"> PAGEREF _Toc242024349 \h </w:instrText>
+              <w:instrText xml:space="preserve"> PAGEREF _Toc243326514 \h </w:instrText>
             </w:r>
             <w:r>
               <w:rPr>
@@ -484,7 +484,7 @@
               <w14:ligatures w14:val="standardContextual"/>
             </w:rPr>
           </w:pPr>
-          <w:hyperlink w:anchor="_Toc242024350" w:history="1">
+          <w:hyperlink w:anchor="_Toc243326515" w:history="1">
             <w:r>
               <w:rPr>
                 <w:rStyle w:val="Hipervnculo"/>
@@ -508,7 +508,7 @@
               <w:rPr>
                 <w:noProof/>
               </w:rPr>
-              <w:instrText xml:space="preserve"> PAGEREF _Toc242024350 \h </w:instrText>
+              <w:instrText xml:space="preserve"> PAGEREF _Toc243326515 \h </w:instrText>
             </w:r>
             <w:r>
               <w:rPr>
@@ -550,7 +550,7 @@
               <w14:ligatures w14:val="standardContextual"/>
             </w:rPr>
           </w:pPr>
-          <w:hyperlink w:anchor="_Toc242024351" w:history="1">
+          <w:hyperlink w:anchor="_Toc243326516" w:history="1">
             <w:r>
               <w:rPr>
                 <w:rStyle w:val="Hipervnculo"/>
@@ -574,7 +574,7 @@
               <w:rPr>
                 <w:noProof/>
               </w:rPr>
-              <w:instrText xml:space="preserve"> PAGEREF _Toc242024351 \h </w:instrText>
+              <w:instrText xml:space="preserve"> PAGEREF _Toc243326516 \h </w:instrText>
             </w:r>
             <w:r>
               <w:rPr>
@@ -616,7 +616,7 @@
               <w14:ligatures w14:val="standardContextual"/>
             </w:rPr>
           </w:pPr>
-          <w:hyperlink w:anchor="_Toc242024352" w:history="1">
+          <w:hyperlink w:anchor="_Toc243326517" w:history="1">
             <w:r>
               <w:rPr>
                 <w:rStyle w:val="Hipervnculo"/>
@@ -640,7 +640,7 @@
               <w:rPr>
                 <w:noProof/>
               </w:rPr>
-              <w:instrText xml:space="preserve"> PAGEREF _Toc242024352 \h </w:instrText>
+              <w:instrText xml:space="preserve"> PAGEREF _Toc243326517 \h </w:instrText>
             </w:r>
             <w:r>
               <w:rPr>
@@ -682,7 +682,7 @@
               <w14:ligatures w14:val="standardContextual"/>
             </w:rPr>
           </w:pPr>
-          <w:hyperlink w:anchor="_Toc242024353" w:history="1">
+          <w:hyperlink w:anchor="_Toc243326518" w:history="1">
             <w:r>
               <w:rPr>
                 <w:rStyle w:val="Hipervnculo"/>
@@ -706,7 +706,7 @@
               <w:rPr>
                 <w:noProof/>
               </w:rPr>
-              <w:instrText xml:space="preserve"> PAGEREF _Toc242024353 \h </w:instrText>
+              <w:instrText xml:space="preserve"> PAGEREF _Toc243326518 \h </w:instrText>
             </w:r>
             <w:r>
               <w:rPr>
@@ -748,7 +748,7 @@
               <w14:ligatures w14:val="standardContextual"/>
             </w:rPr>
           </w:pPr>
-          <w:hyperlink w:anchor="_Toc242024354" w:history="1">
+          <w:hyperlink w:anchor="_Toc243326519" w:history="1">
             <w:r>
               <w:rPr>
                 <w:rStyle w:val="Hipervnculo"/>
@@ -772,7 +772,7 @@
               <w:rPr>
                 <w:noProof/>
               </w:rPr>
-              <w:instrText xml:space="preserve"> PAGEREF _Toc242024354 \h </w:instrText>
+              <w:instrText xml:space="preserve"> PAGEREF _Toc243326519 \h </w:instrText>
             </w:r>
             <w:r>
               <w:rPr>
@@ -822,7 +822,7 @@
         <w:keepNext/>
         <w:keepLines/>
       </w:pPr>
-      <w:bookmarkStart w:id="0" w:name="_Toc242024345"/>
+      <w:bookmarkStart w:id="0" w:name="_Toc243326510"/>
       <w:r>
         <w:lastRenderedPageBreak/>
         <w:t>Configuración técnica de servicios y contenedores</w:t>
@@ -835,7 +835,7 @@
         <w:keepNext/>
         <w:keepLines/>
       </w:pPr>
-      <w:bookmarkStart w:id="1" w:name="_Toc242024346"/>
+      <w:bookmarkStart w:id="1" w:name="_Toc243326511"/>
       <w:r>
         <w:t>Propósito del documento</w:t>
       </w:r>
@@ -846,7 +846,10 @@
         <w:ind w:firstLine="720"/>
       </w:pPr>
       <w:r>
-        <w:t>Este documento describe la configuración técnica de todos los servicios y contenedores del sistema de monitoreo: cómo está organizado el repositorio, cómo se define cada servicio en Docker Compose, qué imágenes y versiones usa, cómo se configuran Kafka, NGINX, PostgreSQL, Redis, Grafana, Elasticsearch y Airflow, qué variables de entorno existen y cómo se pone en marcha y se verifica el sistema. Corresponde al tercer entregable de la sección 8 del enunciado. Toda la configuración está versionada en el repositorio https://github.com/nglVlr/arqui2, de modo que el sistema se reconstruye idéntico en cualquier máquina con Docker.</w:t>
+        <w:t>Este documento describe la configuración técnica de todos los servicios y contenedores del sistema de monitoreo: cómo está organizado el repositorio, cómo se define cada servicio en Docker Compose, qué imágenes y versiones usa, cómo se configuran Kafka, NGINX, PostgreSQL, Redis, Grafana, Elasticsearch y Airflow, qué variables de entorno existen y cómo se pone en marcha y se verifica el sistema. Corresponde al tercer entregable de la sección 8 del enunciado. Toda la configuración está versionada en el reposi</w:t>
+      </w:r>
+      <w:r>
+        <w:t>torio https://github.com/nglVlr/arqui2, de modo que el sistema se reconstruye idéntico en cualquier máquina con Docker.</w:t>
       </w:r>
     </w:p>
     <w:p>
@@ -855,7 +858,7 @@
         <w:keepNext/>
         <w:keepLines/>
       </w:pPr>
-      <w:bookmarkStart w:id="2" w:name="_Toc242024347"/>
+      <w:bookmarkStart w:id="2" w:name="_Toc243326512"/>
       <w:r>
         <w:t>Organización del repositorio</w:t>
       </w:r>
@@ -909,6 +912,12 @@
         <w:gridCol w:w="6365"/>
       </w:tblGrid>
       <w:tr>
+        <w:tblPrEx>
+          <w:tblCellMar>
+            <w:top w:w="0" w:type="dxa"/>
+            <w:bottom w:w="0" w:type="dxa"/>
+          </w:tblCellMar>
+        </w:tblPrEx>
         <w:trPr>
           <w:cantSplit/>
           <w:tblHeader/>
@@ -983,6 +992,12 @@
         </w:tc>
       </w:tr>
       <w:tr>
+        <w:tblPrEx>
+          <w:tblCellMar>
+            <w:top w:w="0" w:type="dxa"/>
+            <w:bottom w:w="0" w:type="dxa"/>
+          </w:tblCellMar>
+        </w:tblPrEx>
         <w:trPr>
           <w:cantSplit/>
         </w:trPr>
@@ -1050,6 +1065,12 @@
         </w:tc>
       </w:tr>
       <w:tr>
+        <w:tblPrEx>
+          <w:tblCellMar>
+            <w:top w:w="0" w:type="dxa"/>
+            <w:bottom w:w="0" w:type="dxa"/>
+          </w:tblCellMar>
+        </w:tblPrEx>
         <w:trPr>
           <w:cantSplit/>
         </w:trPr>
@@ -1117,6 +1138,12 @@
         </w:tc>
       </w:tr>
       <w:tr>
+        <w:tblPrEx>
+          <w:tblCellMar>
+            <w:top w:w="0" w:type="dxa"/>
+            <w:bottom w:w="0" w:type="dxa"/>
+          </w:tblCellMar>
+        </w:tblPrEx>
         <w:trPr>
           <w:cantSplit/>
         </w:trPr>
@@ -1184,6 +1211,12 @@
         </w:tc>
       </w:tr>
       <w:tr>
+        <w:tblPrEx>
+          <w:tblCellMar>
+            <w:top w:w="0" w:type="dxa"/>
+            <w:bottom w:w="0" w:type="dxa"/>
+          </w:tblCellMar>
+        </w:tblPrEx>
         <w:trPr>
           <w:cantSplit/>
         </w:trPr>
@@ -1251,6 +1284,12 @@
         </w:tc>
       </w:tr>
       <w:tr>
+        <w:tblPrEx>
+          <w:tblCellMar>
+            <w:top w:w="0" w:type="dxa"/>
+            <w:bottom w:w="0" w:type="dxa"/>
+          </w:tblCellMar>
+        </w:tblPrEx>
         <w:trPr>
           <w:cantSplit/>
         </w:trPr>
@@ -1318,6 +1357,12 @@
         </w:tc>
       </w:tr>
       <w:tr>
+        <w:tblPrEx>
+          <w:tblCellMar>
+            <w:top w:w="0" w:type="dxa"/>
+            <w:bottom w:w="0" w:type="dxa"/>
+          </w:tblCellMar>
+        </w:tblPrEx>
         <w:trPr>
           <w:cantSplit/>
         </w:trPr>
@@ -1385,6 +1430,12 @@
         </w:tc>
       </w:tr>
       <w:tr>
+        <w:tblPrEx>
+          <w:tblCellMar>
+            <w:top w:w="0" w:type="dxa"/>
+            <w:bottom w:w="0" w:type="dxa"/>
+          </w:tblCellMar>
+        </w:tblPrEx>
         <w:trPr>
           <w:cantSplit/>
         </w:trPr>
@@ -1446,12 +1497,18 @@
                 <w:sz w:val="20"/>
                 <w:szCs w:val="20"/>
               </w:rPr>
-              <w:t>Datasources, proveedor de dashboards y los cuatro dashboards en JSON</w:t>
+              <w:t>Datasources, proveedor de dashboards y los cinco dashboards en JSON</w:t>
             </w:r>
           </w:p>
         </w:tc>
       </w:tr>
       <w:tr>
+        <w:tblPrEx>
+          <w:tblCellMar>
+            <w:top w:w="0" w:type="dxa"/>
+            <w:bottom w:w="0" w:type="dxa"/>
+          </w:tblCellMar>
+        </w:tblPrEx>
         <w:trPr>
           <w:cantSplit/>
         </w:trPr>
@@ -1519,6 +1576,12 @@
         </w:tc>
       </w:tr>
       <w:tr>
+        <w:tblPrEx>
+          <w:tblCellMar>
+            <w:top w:w="0" w:type="dxa"/>
+            <w:bottom w:w="0" w:type="dxa"/>
+          </w:tblCellMar>
+        </w:tblPrEx>
         <w:trPr>
           <w:cantSplit/>
         </w:trPr>
@@ -1586,6 +1649,12 @@
         </w:tc>
       </w:tr>
       <w:tr>
+        <w:tblPrEx>
+          <w:tblCellMar>
+            <w:top w:w="0" w:type="dxa"/>
+            <w:bottom w:w="0" w:type="dxa"/>
+          </w:tblCellMar>
+        </w:tblPrEx>
         <w:trPr>
           <w:cantSplit/>
         </w:trPr>
@@ -1653,6 +1722,12 @@
         </w:tc>
       </w:tr>
       <w:tr>
+        <w:tblPrEx>
+          <w:tblCellMar>
+            <w:top w:w="0" w:type="dxa"/>
+            <w:bottom w:w="0" w:type="dxa"/>
+          </w:tblCellMar>
+        </w:tblPrEx>
         <w:trPr>
           <w:cantSplit/>
         </w:trPr>
@@ -1729,7 +1804,7 @@
         <w:keepNext/>
         <w:keepLines/>
       </w:pPr>
-      <w:bookmarkStart w:id="3" w:name="_Toc242024348"/>
+      <w:bookmarkStart w:id="3" w:name="_Toc243326513"/>
       <w:r>
         <w:lastRenderedPageBreak/>
         <w:t>Docker Compose</w:t>
@@ -1741,7 +1816,10 @@
         <w:ind w:firstLine="720"/>
       </w:pPr>
       <w:r>
-        <w:t>Un solo archivo docker-compose.yml define el sistema completo. Se aplicaron las mismas reglas a todos los servicios: versiones fijas de imagen (nunca latest), límite de memoria (mem_limit), reinicio automático (restart: unless-stopped) en los servicios de larga duración, chequeos de salud (healthcheck) en los servicios de datos y dependencias por estado sano (depends_on con condition: service_healthy), de modo que ningún servicio arranca antes que aquello que necesita. Los servicios se agrupan en perfiles: core (desarrollo), full (agrega Elasticsearch y Airflow) y simulador (a demanda).</w:t>
+        <w:t xml:space="preserve">Un solo archivo docker-compose.yml define el sistema completo. Se aplicaron las mismas reglas a todos los servicios: versiones fijas de imagen (nunca latest), límite de memoria (mem_limit), reinicio automático (restart: unless-stopped) en los servicios de larga duración, chequeos de salud (healthcheck) en los servicios de datos y dependencias por estado sano (depends_on con condition: service_healthy), de modo que ningún servicio arranca antes que aquello que necesita. Los servicios se agrupan en perfiles: </w:t>
+      </w:r>
+      <w:r>
+        <w:t>core (desarrollo), full (agrega Elasticsearch y Airflow) y simulador (a demanda).</w:t>
       </w:r>
     </w:p>
     <w:p>
@@ -1796,6 +1874,12 @@
         <w:gridCol w:w="2018"/>
       </w:tblGrid>
       <w:tr>
+        <w:tblPrEx>
+          <w:tblCellMar>
+            <w:top w:w="0" w:type="dxa"/>
+            <w:bottom w:w="0" w:type="dxa"/>
+          </w:tblCellMar>
+        </w:tblPrEx>
         <w:trPr>
           <w:cantSplit/>
           <w:tblHeader/>
@@ -2006,6 +2090,12 @@
         </w:tc>
       </w:tr>
       <w:tr>
+        <w:tblPrEx>
+          <w:tblCellMar>
+            <w:top w:w="0" w:type="dxa"/>
+            <w:bottom w:w="0" w:type="dxa"/>
+          </w:tblCellMar>
+        </w:tblPrEx>
         <w:trPr>
           <w:cantSplit/>
         </w:trPr>
@@ -2197,6 +2287,12 @@
         </w:tc>
       </w:tr>
       <w:tr>
+        <w:tblPrEx>
+          <w:tblCellMar>
+            <w:top w:w="0" w:type="dxa"/>
+            <w:bottom w:w="0" w:type="dxa"/>
+          </w:tblCellMar>
+        </w:tblPrEx>
         <w:trPr>
           <w:cantSplit/>
         </w:trPr>
@@ -2388,6 +2484,12 @@
         </w:tc>
       </w:tr>
       <w:tr>
+        <w:tblPrEx>
+          <w:tblCellMar>
+            <w:top w:w="0" w:type="dxa"/>
+            <w:bottom w:w="0" w:type="dxa"/>
+          </w:tblCellMar>
+        </w:tblPrEx>
         <w:trPr>
           <w:cantSplit/>
         </w:trPr>
@@ -2579,6 +2681,12 @@
         </w:tc>
       </w:tr>
       <w:tr>
+        <w:tblPrEx>
+          <w:tblCellMar>
+            <w:top w:w="0" w:type="dxa"/>
+            <w:bottom w:w="0" w:type="dxa"/>
+          </w:tblCellMar>
+        </w:tblPrEx>
         <w:trPr>
           <w:cantSplit/>
         </w:trPr>
@@ -2770,6 +2878,12 @@
         </w:tc>
       </w:tr>
       <w:tr>
+        <w:tblPrEx>
+          <w:tblCellMar>
+            <w:top w:w="0" w:type="dxa"/>
+            <w:bottom w:w="0" w:type="dxa"/>
+          </w:tblCellMar>
+        </w:tblPrEx>
         <w:trPr>
           <w:cantSplit/>
         </w:trPr>
@@ -2961,6 +3075,12 @@
         </w:tc>
       </w:tr>
       <w:tr>
+        <w:tblPrEx>
+          <w:tblCellMar>
+            <w:top w:w="0" w:type="dxa"/>
+            <w:bottom w:w="0" w:type="dxa"/>
+          </w:tblCellMar>
+        </w:tblPrEx>
         <w:trPr>
           <w:cantSplit/>
         </w:trPr>
@@ -3152,6 +3272,12 @@
         </w:tc>
       </w:tr>
       <w:tr>
+        <w:tblPrEx>
+          <w:tblCellMar>
+            <w:top w:w="0" w:type="dxa"/>
+            <w:bottom w:w="0" w:type="dxa"/>
+          </w:tblCellMar>
+        </w:tblPrEx>
         <w:trPr>
           <w:cantSplit/>
         </w:trPr>
@@ -3343,6 +3469,12 @@
         </w:tc>
       </w:tr>
       <w:tr>
+        <w:tblPrEx>
+          <w:tblCellMar>
+            <w:top w:w="0" w:type="dxa"/>
+            <w:bottom w:w="0" w:type="dxa"/>
+          </w:tblCellMar>
+        </w:tblPrEx>
         <w:trPr>
           <w:cantSplit/>
         </w:trPr>
@@ -3534,6 +3666,12 @@
         </w:tc>
       </w:tr>
       <w:tr>
+        <w:tblPrEx>
+          <w:tblCellMar>
+            <w:top w:w="0" w:type="dxa"/>
+            <w:bottom w:w="0" w:type="dxa"/>
+          </w:tblCellMar>
+        </w:tblPrEx>
         <w:trPr>
           <w:cantSplit/>
         </w:trPr>
@@ -3725,6 +3863,12 @@
         </w:tc>
       </w:tr>
       <w:tr>
+        <w:tblPrEx>
+          <w:tblCellMar>
+            <w:top w:w="0" w:type="dxa"/>
+            <w:bottom w:w="0" w:type="dxa"/>
+          </w:tblCellMar>
+        </w:tblPrEx>
         <w:trPr>
           <w:cantSplit/>
         </w:trPr>
@@ -3916,6 +4060,12 @@
         </w:tc>
       </w:tr>
       <w:tr>
+        <w:tblPrEx>
+          <w:tblCellMar>
+            <w:top w:w="0" w:type="dxa"/>
+            <w:bottom w:w="0" w:type="dxa"/>
+          </w:tblCellMar>
+        </w:tblPrEx>
         <w:trPr>
           <w:cantSplit/>
         </w:trPr>
@@ -4107,6 +4257,12 @@
         </w:tc>
       </w:tr>
       <w:tr>
+        <w:tblPrEx>
+          <w:tblCellMar>
+            <w:top w:w="0" w:type="dxa"/>
+            <w:bottom w:w="0" w:type="dxa"/>
+          </w:tblCellMar>
+        </w:tblPrEx>
         <w:trPr>
           <w:cantSplit/>
         </w:trPr>
@@ -4298,6 +4454,12 @@
         </w:tc>
       </w:tr>
       <w:tr>
+        <w:tblPrEx>
+          <w:tblCellMar>
+            <w:top w:w="0" w:type="dxa"/>
+            <w:bottom w:w="0" w:type="dxa"/>
+          </w:tblCellMar>
+        </w:tblPrEx>
         <w:trPr>
           <w:cantSplit/>
         </w:trPr>
@@ -4489,6 +4651,12 @@
         </w:tc>
       </w:tr>
       <w:tr>
+        <w:tblPrEx>
+          <w:tblCellMar>
+            <w:top w:w="0" w:type="dxa"/>
+            <w:bottom w:w="0" w:type="dxa"/>
+          </w:tblCellMar>
+        </w:tblPrEx>
         <w:trPr>
           <w:cantSplit/>
         </w:trPr>
@@ -4680,6 +4848,12 @@
         </w:tc>
       </w:tr>
       <w:tr>
+        <w:tblPrEx>
+          <w:tblCellMar>
+            <w:top w:w="0" w:type="dxa"/>
+            <w:bottom w:w="0" w:type="dxa"/>
+          </w:tblCellMar>
+        </w:tblPrEx>
         <w:trPr>
           <w:cantSplit/>
         </w:trPr>
@@ -4948,6 +5122,12 @@
         <w:gridCol w:w="9360"/>
       </w:tblGrid>
       <w:tr>
+        <w:tblPrEx>
+          <w:tblCellMar>
+            <w:top w:w="0" w:type="dxa"/>
+            <w:bottom w:w="0" w:type="dxa"/>
+          </w:tblCellMar>
+        </w:tblPrEx>
         <w:trPr>
           <w:cantSplit/>
         </w:trPr>
@@ -5341,6 +5521,12 @@
         <w:gridCol w:w="1497"/>
       </w:tblGrid>
       <w:tr>
+        <w:tblPrEx>
+          <w:tblCellMar>
+            <w:top w:w="0" w:type="dxa"/>
+            <w:bottom w:w="0" w:type="dxa"/>
+          </w:tblCellMar>
+        </w:tblPrEx>
         <w:trPr>
           <w:cantSplit/>
           <w:tblHeader/>
@@ -5483,6 +5669,12 @@
         </w:tc>
       </w:tr>
       <w:tr>
+        <w:tblPrEx>
+          <w:tblCellMar>
+            <w:top w:w="0" w:type="dxa"/>
+            <w:bottom w:w="0" w:type="dxa"/>
+          </w:tblCellMar>
+        </w:tblPrEx>
         <w:trPr>
           <w:cantSplit/>
         </w:trPr>
@@ -5612,6 +5804,12 @@
         </w:tc>
       </w:tr>
       <w:tr>
+        <w:tblPrEx>
+          <w:tblCellMar>
+            <w:top w:w="0" w:type="dxa"/>
+            <w:bottom w:w="0" w:type="dxa"/>
+          </w:tblCellMar>
+        </w:tblPrEx>
         <w:trPr>
           <w:cantSplit/>
         </w:trPr>
@@ -5741,6 +5939,12 @@
         </w:tc>
       </w:tr>
       <w:tr>
+        <w:tblPrEx>
+          <w:tblCellMar>
+            <w:top w:w="0" w:type="dxa"/>
+            <w:bottom w:w="0" w:type="dxa"/>
+          </w:tblCellMar>
+        </w:tblPrEx>
         <w:trPr>
           <w:cantSplit/>
         </w:trPr>
@@ -5870,6 +6074,12 @@
         </w:tc>
       </w:tr>
       <w:tr>
+        <w:tblPrEx>
+          <w:tblCellMar>
+            <w:top w:w="0" w:type="dxa"/>
+            <w:bottom w:w="0" w:type="dxa"/>
+          </w:tblCellMar>
+        </w:tblPrEx>
         <w:trPr>
           <w:cantSplit/>
         </w:trPr>
@@ -6006,7 +6216,7 @@
         <w:keepNext/>
         <w:keepLines/>
       </w:pPr>
-      <w:bookmarkStart w:id="4" w:name="_Toc242024349"/>
+      <w:bookmarkStart w:id="4" w:name="_Toc243326514"/>
       <w:r>
         <w:t>Imágenes propias</w:t>
       </w:r>
@@ -6071,6 +6281,12 @@
         <w:gridCol w:w="9360"/>
       </w:tblGrid>
       <w:tr>
+        <w:tblPrEx>
+          <w:tblCellMar>
+            <w:top w:w="0" w:type="dxa"/>
+            <w:bottom w:w="0" w:type="dxa"/>
+          </w:tblCellMar>
+        </w:tblPrEx>
         <w:trPr>
           <w:cantSplit/>
         </w:trPr>
@@ -6372,6 +6588,12 @@
         <w:gridCol w:w="7301"/>
       </w:tblGrid>
       <w:tr>
+        <w:tblPrEx>
+          <w:tblCellMar>
+            <w:top w:w="0" w:type="dxa"/>
+            <w:bottom w:w="0" w:type="dxa"/>
+          </w:tblCellMar>
+        </w:tblPrEx>
         <w:trPr>
           <w:cantSplit/>
           <w:tblHeader/>
@@ -6446,6 +6668,12 @@
         </w:tc>
       </w:tr>
       <w:tr>
+        <w:tblPrEx>
+          <w:tblCellMar>
+            <w:top w:w="0" w:type="dxa"/>
+            <w:bottom w:w="0" w:type="dxa"/>
+          </w:tblCellMar>
+        </w:tblPrEx>
         <w:trPr>
           <w:cantSplit/>
         </w:trPr>
@@ -6513,6 +6741,12 @@
         </w:tc>
       </w:tr>
       <w:tr>
+        <w:tblPrEx>
+          <w:tblCellMar>
+            <w:top w:w="0" w:type="dxa"/>
+            <w:bottom w:w="0" w:type="dxa"/>
+          </w:tblCellMar>
+        </w:tblPrEx>
         <w:trPr>
           <w:cantSplit/>
         </w:trPr>
@@ -6580,6 +6814,12 @@
         </w:tc>
       </w:tr>
       <w:tr>
+        <w:tblPrEx>
+          <w:tblCellMar>
+            <w:top w:w="0" w:type="dxa"/>
+            <w:bottom w:w="0" w:type="dxa"/>
+          </w:tblCellMar>
+        </w:tblPrEx>
         <w:trPr>
           <w:cantSplit/>
         </w:trPr>
@@ -6647,6 +6887,12 @@
         </w:tc>
       </w:tr>
       <w:tr>
+        <w:tblPrEx>
+          <w:tblCellMar>
+            <w:top w:w="0" w:type="dxa"/>
+            <w:bottom w:w="0" w:type="dxa"/>
+          </w:tblCellMar>
+        </w:tblPrEx>
         <w:trPr>
           <w:cantSplit/>
         </w:trPr>
@@ -6714,6 +6960,12 @@
         </w:tc>
       </w:tr>
       <w:tr>
+        <w:tblPrEx>
+          <w:tblCellMar>
+            <w:top w:w="0" w:type="dxa"/>
+            <w:bottom w:w="0" w:type="dxa"/>
+          </w:tblCellMar>
+        </w:tblPrEx>
         <w:trPr>
           <w:cantSplit/>
         </w:trPr>
@@ -6790,7 +7042,7 @@
         <w:keepNext/>
         <w:keepLines/>
       </w:pPr>
-      <w:bookmarkStart w:id="5" w:name="_Toc242024350"/>
+      <w:bookmarkStart w:id="5" w:name="_Toc243326515"/>
       <w:r>
         <w:t>Variables de entorno</w:t>
       </w:r>
@@ -6854,6 +7106,12 @@
         <w:gridCol w:w="3471"/>
       </w:tblGrid>
       <w:tr>
+        <w:tblPrEx>
+          <w:tblCellMar>
+            <w:top w:w="0" w:type="dxa"/>
+            <w:bottom w:w="0" w:type="dxa"/>
+          </w:tblCellMar>
+        </w:tblPrEx>
         <w:trPr>
           <w:cantSplit/>
           <w:tblHeader/>
@@ -6962,6 +7220,12 @@
         </w:tc>
       </w:tr>
       <w:tr>
+        <w:tblPrEx>
+          <w:tblCellMar>
+            <w:top w:w="0" w:type="dxa"/>
+            <w:bottom w:w="0" w:type="dxa"/>
+          </w:tblCellMar>
+        </w:tblPrEx>
         <w:trPr>
           <w:cantSplit/>
         </w:trPr>
@@ -7060,6 +7324,12 @@
         </w:tc>
       </w:tr>
       <w:tr>
+        <w:tblPrEx>
+          <w:tblCellMar>
+            <w:top w:w="0" w:type="dxa"/>
+            <w:bottom w:w="0" w:type="dxa"/>
+          </w:tblCellMar>
+        </w:tblPrEx>
         <w:trPr>
           <w:cantSplit/>
         </w:trPr>
@@ -7158,6 +7428,12 @@
         </w:tc>
       </w:tr>
       <w:tr>
+        <w:tblPrEx>
+          <w:tblCellMar>
+            <w:top w:w="0" w:type="dxa"/>
+            <w:bottom w:w="0" w:type="dxa"/>
+          </w:tblCellMar>
+        </w:tblPrEx>
         <w:trPr>
           <w:cantSplit/>
         </w:trPr>
@@ -7256,6 +7532,12 @@
         </w:tc>
       </w:tr>
       <w:tr>
+        <w:tblPrEx>
+          <w:tblCellMar>
+            <w:top w:w="0" w:type="dxa"/>
+            <w:bottom w:w="0" w:type="dxa"/>
+          </w:tblCellMar>
+        </w:tblPrEx>
         <w:trPr>
           <w:cantSplit/>
         </w:trPr>
@@ -7354,6 +7636,12 @@
         </w:tc>
       </w:tr>
       <w:tr>
+        <w:tblPrEx>
+          <w:tblCellMar>
+            <w:top w:w="0" w:type="dxa"/>
+            <w:bottom w:w="0" w:type="dxa"/>
+          </w:tblCellMar>
+        </w:tblPrEx>
         <w:trPr>
           <w:cantSplit/>
         </w:trPr>
@@ -7452,6 +7740,12 @@
         </w:tc>
       </w:tr>
       <w:tr>
+        <w:tblPrEx>
+          <w:tblCellMar>
+            <w:top w:w="0" w:type="dxa"/>
+            <w:bottom w:w="0" w:type="dxa"/>
+          </w:tblCellMar>
+        </w:tblPrEx>
         <w:trPr>
           <w:cantSplit/>
         </w:trPr>
@@ -7550,6 +7844,12 @@
         </w:tc>
       </w:tr>
       <w:tr>
+        <w:tblPrEx>
+          <w:tblCellMar>
+            <w:top w:w="0" w:type="dxa"/>
+            <w:bottom w:w="0" w:type="dxa"/>
+          </w:tblCellMar>
+        </w:tblPrEx>
         <w:trPr>
           <w:cantSplit/>
         </w:trPr>
@@ -7648,6 +7948,12 @@
         </w:tc>
       </w:tr>
       <w:tr>
+        <w:tblPrEx>
+          <w:tblCellMar>
+            <w:top w:w="0" w:type="dxa"/>
+            <w:bottom w:w="0" w:type="dxa"/>
+          </w:tblCellMar>
+        </w:tblPrEx>
         <w:trPr>
           <w:cantSplit/>
         </w:trPr>
@@ -7746,6 +8052,12 @@
         </w:tc>
       </w:tr>
       <w:tr>
+        <w:tblPrEx>
+          <w:tblCellMar>
+            <w:top w:w="0" w:type="dxa"/>
+            <w:bottom w:w="0" w:type="dxa"/>
+          </w:tblCellMar>
+        </w:tblPrEx>
         <w:trPr>
           <w:cantSplit/>
         </w:trPr>
@@ -7844,6 +8156,12 @@
         </w:tc>
       </w:tr>
       <w:tr>
+        <w:tblPrEx>
+          <w:tblCellMar>
+            <w:top w:w="0" w:type="dxa"/>
+            <w:bottom w:w="0" w:type="dxa"/>
+          </w:tblCellMar>
+        </w:tblPrEx>
         <w:trPr>
           <w:cantSplit/>
         </w:trPr>
@@ -7942,6 +8260,12 @@
         </w:tc>
       </w:tr>
       <w:tr>
+        <w:tblPrEx>
+          <w:tblCellMar>
+            <w:top w:w="0" w:type="dxa"/>
+            <w:bottom w:w="0" w:type="dxa"/>
+          </w:tblCellMar>
+        </w:tblPrEx>
         <w:trPr>
           <w:cantSplit/>
         </w:trPr>
@@ -8048,7 +8372,7 @@
         <w:keepNext/>
         <w:keepLines/>
       </w:pPr>
-      <w:bookmarkStart w:id="6" w:name="_Toc242024351"/>
+      <w:bookmarkStart w:id="6" w:name="_Toc243326516"/>
       <w:r>
         <w:t>Configuración por componente</w:t>
       </w:r>
@@ -8120,6 +8444,12 @@
         <w:gridCol w:w="9360"/>
       </w:tblGrid>
       <w:tr>
+        <w:tblPrEx>
+          <w:tblCellMar>
+            <w:top w:w="0" w:type="dxa"/>
+            <w:bottom w:w="0" w:type="dxa"/>
+          </w:tblCellMar>
+        </w:tblPrEx>
         <w:trPr>
           <w:cantSplit/>
         </w:trPr>
@@ -8544,6 +8874,12 @@
         <w:gridCol w:w="9360"/>
       </w:tblGrid>
       <w:tr>
+        <w:tblPrEx>
+          <w:tblCellMar>
+            <w:top w:w="0" w:type="dxa"/>
+            <w:bottom w:w="0" w:type="dxa"/>
+          </w:tblCellMar>
+        </w:tblPrEx>
         <w:trPr>
           <w:cantSplit/>
         </w:trPr>
@@ -9075,6 +9411,12 @@
         <w:gridCol w:w="2434"/>
       </w:tblGrid>
       <w:tr>
+        <w:tblPrEx>
+          <w:tblCellMar>
+            <w:top w:w="0" w:type="dxa"/>
+            <w:bottom w:w="0" w:type="dxa"/>
+          </w:tblCellMar>
+        </w:tblPrEx>
         <w:trPr>
           <w:cantSplit/>
           <w:tblHeader/>
@@ -9183,6 +9525,12 @@
         </w:tc>
       </w:tr>
       <w:tr>
+        <w:tblPrEx>
+          <w:tblCellMar>
+            <w:top w:w="0" w:type="dxa"/>
+            <w:bottom w:w="0" w:type="dxa"/>
+          </w:tblCellMar>
+        </w:tblPrEx>
         <w:trPr>
           <w:cantSplit/>
         </w:trPr>
@@ -9281,6 +9629,12 @@
         </w:tc>
       </w:tr>
       <w:tr>
+        <w:tblPrEx>
+          <w:tblCellMar>
+            <w:top w:w="0" w:type="dxa"/>
+            <w:bottom w:w="0" w:type="dxa"/>
+          </w:tblCellMar>
+        </w:tblPrEx>
         <w:trPr>
           <w:cantSplit/>
         </w:trPr>
@@ -9379,6 +9733,12 @@
         </w:tc>
       </w:tr>
       <w:tr>
+        <w:tblPrEx>
+          <w:tblCellMar>
+            <w:top w:w="0" w:type="dxa"/>
+            <w:bottom w:w="0" w:type="dxa"/>
+          </w:tblCellMar>
+        </w:tblPrEx>
         <w:trPr>
           <w:cantSplit/>
         </w:trPr>
@@ -9477,6 +9837,12 @@
         </w:tc>
       </w:tr>
       <w:tr>
+        <w:tblPrEx>
+          <w:tblCellMar>
+            <w:top w:w="0" w:type="dxa"/>
+            <w:bottom w:w="0" w:type="dxa"/>
+          </w:tblCellMar>
+        </w:tblPrEx>
         <w:trPr>
           <w:cantSplit/>
         </w:trPr>
@@ -9575,6 +9941,12 @@
         </w:tc>
       </w:tr>
       <w:tr>
+        <w:tblPrEx>
+          <w:tblCellMar>
+            <w:top w:w="0" w:type="dxa"/>
+            <w:bottom w:w="0" w:type="dxa"/>
+          </w:tblCellMar>
+        </w:tblPrEx>
         <w:trPr>
           <w:cantSplit/>
         </w:trPr>
@@ -9673,6 +10045,12 @@
         </w:tc>
       </w:tr>
       <w:tr>
+        <w:tblPrEx>
+          <w:tblCellMar>
+            <w:top w:w="0" w:type="dxa"/>
+            <w:bottom w:w="0" w:type="dxa"/>
+          </w:tblCellMar>
+        </w:tblPrEx>
         <w:trPr>
           <w:cantSplit/>
         </w:trPr>
@@ -9771,6 +10149,12 @@
         </w:tc>
       </w:tr>
       <w:tr>
+        <w:tblPrEx>
+          <w:tblCellMar>
+            <w:top w:w="0" w:type="dxa"/>
+            <w:bottom w:w="0" w:type="dxa"/>
+          </w:tblCellMar>
+        </w:tblPrEx>
         <w:trPr>
           <w:cantSplit/>
         </w:trPr>
@@ -9869,6 +10253,12 @@
         </w:tc>
       </w:tr>
       <w:tr>
+        <w:tblPrEx>
+          <w:tblCellMar>
+            <w:top w:w="0" w:type="dxa"/>
+            <w:bottom w:w="0" w:type="dxa"/>
+          </w:tblCellMar>
+        </w:tblPrEx>
         <w:trPr>
           <w:cantSplit/>
         </w:trPr>
@@ -9967,6 +10357,12 @@
         </w:tc>
       </w:tr>
       <w:tr>
+        <w:tblPrEx>
+          <w:tblCellMar>
+            <w:top w:w="0" w:type="dxa"/>
+            <w:bottom w:w="0" w:type="dxa"/>
+          </w:tblCellMar>
+        </w:tblPrEx>
         <w:trPr>
           <w:cantSplit/>
         </w:trPr>
@@ -10100,7 +10496,7 @@
         <w:ind w:firstLine="720"/>
       </w:pPr>
       <w:r>
-        <w:t>Grafana 12.4 se configura por archivos (aprovisionamiento): el datasource de PostgreSQL usa el usuario grafana_ro y el de Elasticsearch apunta al índice alertas (Figura 5); un proveedor carga los cuatro dashboards desde infra/grafana/dashboards. Las contraseñas se toman de variables de entorno, no del archivo. El detalle de los dashboards está en el Entregable 6.</w:t>
+        <w:t>Grafana 12.4 se configura por archivos (aprovisionamiento): el datasource de PostgreSQL usa el usuario grafana_ro y el de Elasticsearch apunta al índice alertas (Figura 5); un proveedor carga los cinco dashboards desde infra/grafana/dashboards. Las contraseñas se toman de variables de entorno, no del archivo. El detalle de los dashboards está en el Entregable 6.</w:t>
       </w:r>
     </w:p>
     <w:p>
@@ -10151,6 +10547,12 @@
         <w:gridCol w:w="9360"/>
       </w:tblGrid>
       <w:tr>
+        <w:tblPrEx>
+          <w:tblCellMar>
+            <w:top w:w="0" w:type="dxa"/>
+            <w:bottom w:w="0" w:type="dxa"/>
+          </w:tblCellMar>
+        </w:tblPrEx>
         <w:trPr>
           <w:cantSplit/>
         </w:trPr>
@@ -10593,7 +10995,7 @@
         <w:keepNext/>
         <w:keepLines/>
       </w:pPr>
-      <w:bookmarkStart w:id="7" w:name="_Toc242024352"/>
+      <w:bookmarkStart w:id="7" w:name="_Toc243326517"/>
       <w:r>
         <w:t>Puesta en marcha y operación</w:t>
       </w:r>
@@ -10655,6 +11057,12 @@
         <w:gridCol w:w="9360"/>
       </w:tblGrid>
       <w:tr>
+        <w:tblPrEx>
+          <w:tblCellMar>
+            <w:top w:w="0" w:type="dxa"/>
+            <w:bottom w:w="0" w:type="dxa"/>
+          </w:tblCellMar>
+        </w:tblPrEx>
         <w:trPr>
           <w:cantSplit/>
         </w:trPr>
@@ -10854,7 +11262,7 @@
         <w:keepNext/>
         <w:keepLines/>
       </w:pPr>
-      <w:bookmarkStart w:id="8" w:name="_Toc242024353"/>
+      <w:bookmarkStart w:id="8" w:name="_Toc243326518"/>
       <w:r>
         <w:t>Verificación</w:t>
       </w:r>
@@ -10865,7 +11273,7 @@
         <w:ind w:firstLine="720"/>
       </w:pPr>
       <w:r>
-        <w:t>La configuración se verificó de tres formas: clonando el repositorio en una carpeta nueva y levantando el sistema desde cero siguiendo solo el manual (todos los servicios iniciaron y los escenarios generaron sus alertas); revisando con docker compose ps que los servicios con chequeo de salud aparezcan como healthy; y ejecutando el script pruebas/grafana/validar-dashboards.ps1, que corre las 30 consultas de los cuatro dashboards contra Grafana (30 correctas, 0 errores).</w:t>
+        <w:t>La configuración se verificó de tres formas: clonando el repositorio en una carpeta nueva y levantando el sistema desde cero siguiendo solo el manual (todos los servicios iniciaron y los escenarios generaron sus alertas); revisando con docker compose ps que los servicios con chequeo de salud aparezcan como healthy; y ejecutando el script pruebas/grafana/validar-dashboards.ps1, que corre las 37 consultas de los cinco dashboards contra Grafana (37 correctas, 0 errores).</w:t>
       </w:r>
     </w:p>
     <w:p>
@@ -10879,7 +11287,7 @@
         <w:keepNext/>
         <w:keepLines/>
       </w:pPr>
-      <w:bookmarkStart w:id="9" w:name="_Toc242024354"/>
+      <w:bookmarkStart w:id="9" w:name="_Toc243326519"/>
       <w:r>
         <w:lastRenderedPageBreak/>
         <w:t>Referencias</w:t>
@@ -11015,64 +11423,10 @@
 <file path=word/numbering.xml><?xml version="1.0" encoding="utf-8"?>
 <w:numbering xmlns:wpc="http://schemas.microsoft.com/office/word/2010/wordprocessingCanvas" xmlns:cx="http://schemas.microsoft.com/office/drawing/2014/chartex" xmlns:cx1="http://schemas.microsoft.com/office/drawing/2015/9/8/chartex" xmlns:cx2="http://schemas.microsoft.com/office/drawing/2015/10/21/chartex" xmlns:cx3="http://schemas.microsoft.com/office/drawing/2016/5/9/chartex" xmlns:cx4="http://schemas.microsoft.com/office/drawing/2016/5/10/chartex" xmlns:cx5="http://schemas.microsoft.com/office/drawing/2016/5/11/chartex" xmlns:cx6="http://schemas.microsoft.com/office/drawing/2016/5/12/chartex" xmlns:cx7="http://schemas.microsoft.com/office/drawing/2016/5/13/chartex" xmlns:cx8="http://schemas.microsoft.com/office/drawing/2016/5/14/chartex" xmlns:mc="http://schemas.openxmlformats.org/markup-compatibility/2006" xmlns:aink="http://schemas.microsoft.com/office/drawing/2016/ink" xmlns:am3d="http://schemas.microsoft.com/office/drawing/2017/model3d" xmlns:o="urn:schemas-microsoft-com:office:office" xmlns:oel="http://schemas.microsoft.com/office/2019/extlst" xmlns:r="http://schemas.openxmlformats.org/officeDocument/2006/relationships" xmlns:m="http://schemas.openxmlformats.org/officeDocument/2006/math" xmlns:v="urn:schemas-microsoft-com:vml" xmlns:wp14="http://schemas.microsoft.com/office/word/2010/wordprocessingDrawing" xmlns:wp="http://schemas.openxmlformats.org/drawingml/2006/wordprocessingDrawing" xmlns:w10="urn:schemas-microsoft-com:office:word" xmlns:w="http://schemas.openxmlformats.org/wordprocessingml/2006/main" xmlns:w14="http://schemas.microsoft.com/office/word/2010/wordml" xmlns:w15="http://schemas.microsoft.com/office/word/2012/wordml" xmlns:w16cex="http://schemas.microsoft.com/office/word/2018/wordml/cex" xmlns:w16cid="http://schemas.microsoft.com/office/word/2016/wordml/cid" xmlns:w16="http://schemas.microsoft.com/office/word/2018/wordml" xmlns:w16sdtdh="http://schemas.microsoft.com/office/word/2020/wordml/sdtdatahash" xmlns:w16se="http://schemas.microsoft.com/office/word/2015/wordml/symex" xmlns:wpg="http://schemas.microsoft.com/office/word/2010/wordprocessingGroup" xmlns:wpi="http://schemas.microsoft.com/office/word/2010/wordprocessingInk" xmlns:wne="http://schemas.microsoft.com/office/word/2006/wordml" xmlns:wps="http://schemas.microsoft.com/office/word/2010/wordprocessingShape" mc:Ignorable="w14 w15 w16se w16cid w16 w16cex w16sdtdh wp14">
   <w:abstractNum w:abstractNumId="0" w15:restartNumberingAfterBreak="0">
-    <w:nsid w:val="105B3058"/>
+    <w:nsid w:val="15440B7A"/>
     <w:multiLevelType w:val="hybridMultilevel"/>
-    <w:tmpl w:val="DE30824C"/>
-    <w:lvl w:ilvl="0" w:tplc="0CB03B6E" w:tentative="1">
-      <w:start w:val="1"/>
-      <w:numFmt w:val="bullet"/>
-      <w:lvlText w:val="•"/>
-      <w:lvlJc w:val="left"/>
-      <w:pPr>
-        <w:ind w:left="720" w:hanging="360"/>
-      </w:pPr>
-    </w:lvl>
-    <w:lvl w:ilvl="1" w:tplc="5CC0862A">
-      <w:numFmt w:val="decimal"/>
-      <w:lvlText w:val=""/>
-      <w:lvlJc w:val="left"/>
-    </w:lvl>
-    <w:lvl w:ilvl="2" w:tplc="5B9A896E">
-      <w:numFmt w:val="decimal"/>
-      <w:lvlText w:val=""/>
-      <w:lvlJc w:val="left"/>
-    </w:lvl>
-    <w:lvl w:ilvl="3" w:tplc="D41CBD42">
-      <w:numFmt w:val="decimal"/>
-      <w:lvlText w:val=""/>
-      <w:lvlJc w:val="left"/>
-    </w:lvl>
-    <w:lvl w:ilvl="4" w:tplc="0AF25200">
-      <w:numFmt w:val="decimal"/>
-      <w:lvlText w:val=""/>
-      <w:lvlJc w:val="left"/>
-    </w:lvl>
-    <w:lvl w:ilvl="5" w:tplc="23F82E78">
-      <w:numFmt w:val="decimal"/>
-      <w:lvlText w:val=""/>
-      <w:lvlJc w:val="left"/>
-    </w:lvl>
-    <w:lvl w:ilvl="6" w:tplc="FE4E8B7E">
-      <w:numFmt w:val="decimal"/>
-      <w:lvlText w:val=""/>
-      <w:lvlJc w:val="left"/>
-    </w:lvl>
-    <w:lvl w:ilvl="7" w:tplc="05A85F32">
-      <w:numFmt w:val="decimal"/>
-      <w:lvlText w:val=""/>
-      <w:lvlJc w:val="left"/>
-    </w:lvl>
-    <w:lvl w:ilvl="8" w:tplc="5FF6EDA0">
-      <w:numFmt w:val="decimal"/>
-      <w:lvlText w:val=""/>
-      <w:lvlJc w:val="left"/>
-    </w:lvl>
-  </w:abstractNum>
-  <w:abstractNum w:abstractNumId="1" w15:restartNumberingAfterBreak="0">
-    <w:nsid w:val="57CD10E6"/>
-    <w:multiLevelType w:val="hybridMultilevel"/>
-    <w:tmpl w:val="14C8C462"/>
-    <w:lvl w:ilvl="0" w:tplc="711A846C" w:tentative="1">
+    <w:tmpl w:val="EE96B400"/>
+    <w:lvl w:ilvl="0" w:tplc="FA0EAC5A" w:tentative="1">
       <w:start w:val="1"/>
       <w:numFmt w:val="bullet"/>
       <w:lvlText w:val="●"/>
@@ -11081,7 +11435,7 @@
         <w:ind w:left="720" w:hanging="360"/>
       </w:pPr>
     </w:lvl>
-    <w:lvl w:ilvl="1" w:tplc="B644E9DC" w:tentative="1">
+    <w:lvl w:ilvl="1" w:tplc="6CC4063A" w:tentative="1">
       <w:start w:val="1"/>
       <w:numFmt w:val="bullet"/>
       <w:lvlText w:val="○"/>
@@ -11090,7 +11444,7 @@
         <w:ind w:left="1440" w:hanging="360"/>
       </w:pPr>
     </w:lvl>
-    <w:lvl w:ilvl="2" w:tplc="594AF5D4" w:tentative="1">
+    <w:lvl w:ilvl="2" w:tplc="2E4C6538" w:tentative="1">
       <w:start w:val="1"/>
       <w:numFmt w:val="bullet"/>
       <w:lvlText w:val="■"/>
@@ -11099,7 +11453,7 @@
         <w:ind w:left="2160" w:hanging="360"/>
       </w:pPr>
     </w:lvl>
-    <w:lvl w:ilvl="3" w:tplc="7A663BD0" w:tentative="1">
+    <w:lvl w:ilvl="3" w:tplc="77CAFCAC" w:tentative="1">
       <w:start w:val="1"/>
       <w:numFmt w:val="bullet"/>
       <w:lvlText w:val="●"/>
@@ -11108,7 +11462,7 @@
         <w:ind w:left="2880" w:hanging="360"/>
       </w:pPr>
     </w:lvl>
-    <w:lvl w:ilvl="4" w:tplc="11F075A0" w:tentative="1">
+    <w:lvl w:ilvl="4" w:tplc="1B12EF4E" w:tentative="1">
       <w:start w:val="1"/>
       <w:numFmt w:val="bullet"/>
       <w:lvlText w:val="○"/>
@@ -11117,7 +11471,7 @@
         <w:ind w:left="3600" w:hanging="360"/>
       </w:pPr>
     </w:lvl>
-    <w:lvl w:ilvl="5" w:tplc="1F16CF5C" w:tentative="1">
+    <w:lvl w:ilvl="5" w:tplc="1EF64ECE" w:tentative="1">
       <w:start w:val="1"/>
       <w:numFmt w:val="bullet"/>
       <w:lvlText w:val="■"/>
@@ -11126,7 +11480,7 @@
         <w:ind w:left="4320" w:hanging="360"/>
       </w:pPr>
     </w:lvl>
-    <w:lvl w:ilvl="6" w:tplc="97122E84" w:tentative="1">
+    <w:lvl w:ilvl="6" w:tplc="9208A7AC" w:tentative="1">
       <w:start w:val="1"/>
       <w:numFmt w:val="bullet"/>
       <w:lvlText w:val="●"/>
@@ -11135,7 +11489,7 @@
         <w:ind w:left="5040" w:hanging="360"/>
       </w:pPr>
     </w:lvl>
-    <w:lvl w:ilvl="7" w:tplc="C91002AC" w:tentative="1">
+    <w:lvl w:ilvl="7" w:tplc="018A604A" w:tentative="1">
       <w:start w:val="1"/>
       <w:numFmt w:val="bullet"/>
       <w:lvlText w:val="●"/>
@@ -11144,7 +11498,7 @@
         <w:ind w:left="5760" w:hanging="360"/>
       </w:pPr>
     </w:lvl>
-    <w:lvl w:ilvl="8" w:tplc="E3A277E8" w:tentative="1">
+    <w:lvl w:ilvl="8" w:tplc="8770696C" w:tentative="1">
       <w:start w:val="1"/>
       <w:numFmt w:val="bullet"/>
       <w:lvlText w:val="●"/>
@@ -11154,11 +11508,65 @@
       </w:pPr>
     </w:lvl>
   </w:abstractNum>
+  <w:abstractNum w:abstractNumId="1" w15:restartNumberingAfterBreak="0">
+    <w:nsid w:val="57D42674"/>
+    <w:multiLevelType w:val="hybridMultilevel"/>
+    <w:tmpl w:val="E0129188"/>
+    <w:lvl w:ilvl="0" w:tplc="9B98BED0" w:tentative="1">
+      <w:start w:val="1"/>
+      <w:numFmt w:val="bullet"/>
+      <w:lvlText w:val="•"/>
+      <w:lvlJc w:val="left"/>
+      <w:pPr>
+        <w:ind w:left="720" w:hanging="360"/>
+      </w:pPr>
+    </w:lvl>
+    <w:lvl w:ilvl="1" w:tplc="AA364B84">
+      <w:numFmt w:val="decimal"/>
+      <w:lvlText w:val=""/>
+      <w:lvlJc w:val="left"/>
+    </w:lvl>
+    <w:lvl w:ilvl="2" w:tplc="629C73E2">
+      <w:numFmt w:val="decimal"/>
+      <w:lvlText w:val=""/>
+      <w:lvlJc w:val="left"/>
+    </w:lvl>
+    <w:lvl w:ilvl="3" w:tplc="3A9CE584">
+      <w:numFmt w:val="decimal"/>
+      <w:lvlText w:val=""/>
+      <w:lvlJc w:val="left"/>
+    </w:lvl>
+    <w:lvl w:ilvl="4" w:tplc="86A049F4">
+      <w:numFmt w:val="decimal"/>
+      <w:lvlText w:val=""/>
+      <w:lvlJc w:val="left"/>
+    </w:lvl>
+    <w:lvl w:ilvl="5" w:tplc="99166D48">
+      <w:numFmt w:val="decimal"/>
+      <w:lvlText w:val=""/>
+      <w:lvlJc w:val="left"/>
+    </w:lvl>
+    <w:lvl w:ilvl="6" w:tplc="E1C61608">
+      <w:numFmt w:val="decimal"/>
+      <w:lvlText w:val=""/>
+      <w:lvlJc w:val="left"/>
+    </w:lvl>
+    <w:lvl w:ilvl="7" w:tplc="96C0ADE6">
+      <w:numFmt w:val="decimal"/>
+      <w:lvlText w:val=""/>
+      <w:lvlJc w:val="left"/>
+    </w:lvl>
+    <w:lvl w:ilvl="8" w:tplc="CA84B6C6">
+      <w:numFmt w:val="decimal"/>
+      <w:lvlText w:val=""/>
+      <w:lvlJc w:val="left"/>
+    </w:lvl>
+  </w:abstractNum>
   <w:abstractNum w:abstractNumId="2" w15:restartNumberingAfterBreak="0">
-    <w:nsid w:val="732F1478"/>
+    <w:nsid w:val="7BB53305"/>
     <w:multiLevelType w:val="hybridMultilevel"/>
-    <w:tmpl w:val="C2EED3E0"/>
-    <w:lvl w:ilvl="0" w:tplc="D1E4D3E2" w:tentative="1">
+    <w:tmpl w:val="E3829DEE"/>
+    <w:lvl w:ilvl="0" w:tplc="2A569E60" w:tentative="1">
       <w:start w:val="1"/>
       <w:numFmt w:val="decimal"/>
       <w:lvlText w:val="%1."/>
@@ -11167,49 +11575,49 @@
         <w:ind w:left="720" w:hanging="360"/>
       </w:pPr>
     </w:lvl>
-    <w:lvl w:ilvl="1" w:tplc="0C7406FE">
+    <w:lvl w:ilvl="1" w:tplc="42506194">
       <w:numFmt w:val="decimal"/>
       <w:lvlText w:val=""/>
       <w:lvlJc w:val="left"/>
     </w:lvl>
-    <w:lvl w:ilvl="2" w:tplc="8E70CF4C">
+    <w:lvl w:ilvl="2" w:tplc="E08AD260">
       <w:numFmt w:val="decimal"/>
       <w:lvlText w:val=""/>
       <w:lvlJc w:val="left"/>
     </w:lvl>
-    <w:lvl w:ilvl="3" w:tplc="4978EC94">
+    <w:lvl w:ilvl="3" w:tplc="33CA5B9A">
       <w:numFmt w:val="decimal"/>
       <w:lvlText w:val=""/>
       <w:lvlJc w:val="left"/>
     </w:lvl>
-    <w:lvl w:ilvl="4" w:tplc="6B287B8A">
+    <w:lvl w:ilvl="4" w:tplc="9F0C242C">
       <w:numFmt w:val="decimal"/>
       <w:lvlText w:val=""/>
       <w:lvlJc w:val="left"/>
     </w:lvl>
-    <w:lvl w:ilvl="5" w:tplc="C1F09CB8">
+    <w:lvl w:ilvl="5" w:tplc="FA3095EE">
       <w:numFmt w:val="decimal"/>
       <w:lvlText w:val=""/>
       <w:lvlJc w:val="left"/>
     </w:lvl>
-    <w:lvl w:ilvl="6" w:tplc="A58A4B9C">
+    <w:lvl w:ilvl="6" w:tplc="6846B974">
       <w:numFmt w:val="decimal"/>
       <w:lvlText w:val=""/>
       <w:lvlJc w:val="left"/>
     </w:lvl>
-    <w:lvl w:ilvl="7" w:tplc="19983CFC">
+    <w:lvl w:ilvl="7" w:tplc="44E09316">
       <w:numFmt w:val="decimal"/>
       <w:lvlText w:val=""/>
       <w:lvlJc w:val="left"/>
     </w:lvl>
-    <w:lvl w:ilvl="8" w:tplc="F87C478E">
+    <w:lvl w:ilvl="8" w:tplc="1C240AD0">
       <w:numFmt w:val="decimal"/>
       <w:lvlText w:val=""/>
       <w:lvlJc w:val="left"/>
     </w:lvl>
   </w:abstractNum>
-  <w:num w:numId="1" w16cid:durableId="1581451614">
-    <w:abstractNumId w:val="1"/>
+  <w:num w:numId="1" w16cid:durableId="109206724">
+    <w:abstractNumId w:val="0"/>
     <w:lvlOverride w:ilvl="0">
       <w:startOverride w:val="1"/>
     </w:lvlOverride>
@@ -11855,7 +12263,7 @@
     <w:autoRedefine/>
     <w:uiPriority w:val="39"/>
     <w:unhideWhenUsed/>
-    <w:rsid w:val="00BC2AFE"/>
+    <w:rsid w:val="00164475"/>
     <w:pPr>
       <w:spacing w:after="100"/>
     </w:pPr>
@@ -11867,7 +12275,7 @@
     <w:autoRedefine/>
     <w:uiPriority w:val="39"/>
     <w:unhideWhenUsed/>
-    <w:rsid w:val="00BC2AFE"/>
+    <w:rsid w:val="00164475"/>
     <w:pPr>
       <w:spacing w:after="100"/>
       <w:ind w:left="240"/>

</xml_diff>